<commit_message>
make first impression video section (top page)
</commit_message>
<xml_diff>
--- a/other_file/design_pieces.docx
+++ b/other_file/design_pieces.docx
@@ -1474,13 +1474,63 @@
     </w:p>
     <w:p/>
     <w:p>
-      <w:pPr>
+      <w:r>
+        <w:t>「コードを通じてチームのハブに」</w:t>
+      </w:r>
+    </w:p>
+    <w:p/>
+    <w:p>
+      <w:r>
         <w:rPr>
           <w:rFonts w:hint="eastAsia"/>
         </w:rPr>
-      </w:pPr>
-      <w:r>
-        <w:t>「コードを通じてチームのハブに」</w:t>
+        <w:t>各ゲームと行動実績</w:t>
+      </w:r>
+    </w:p>
+    <w:p>
+      <w:r>
+        <w:t>君が想像できるように、僕の技術の具体例を挙げておく。</w:t>
+      </w:r>
+    </w:p>
+    <w:p>
+      <w:r>
+        <w:t>gravityrun</w:t>
+      </w:r>
+    </w:p>
+    <w:p>
+      <w:r>
+        <w:t>いった通りプログラムの構成、設計は大まか自分で設計して、中でも７，８割は自分でちゃんと処理まで書いた。設計したときに書いた仕様書pptxあり。（クラス図）コード自体ははっきり言って読みずらいほうだと思う。まだ僕の中のコードの癖が定まってないからわりとぐちゃぐちゃ、コメントほぼなし。ただし子供から高評という評価あり。難易度調整してプレイヤーが遊びやすくなったというゲームプログラマーとしてコアな技術を学んだことを言える。あとはプロジェクトマネジメントぐらいかな？</w:t>
+      </w:r>
+    </w:p>
+    <w:p>
+      <w:r>
+        <w:t>mogusaPark</w:t>
+      </w:r>
+    </w:p>
+    <w:p>
+      <w:r>
+        <w:t>企業依頼で、企業様から２番目に高評、クオリティは高く、コードも変数、関数名には伝わりやすい名前を付けることをこだわった。リファクタリングも一部あり、継承使用、ワンオペ、あとゲーム最後のシーンは少しだけだが感動できる演出を入れられた。これある意味コアな部分の説明に使えるかも。ほかにも判定あえて広げたりとか。意外とプレイヤーを気遣った設計もしてるわ。ただ面白さはあまり評価されなかったと思う。</w:t>
+      </w:r>
+    </w:p>
+    <w:p>
+      <w:r>
+        <w:t>CodeLoader</w:t>
+      </w:r>
+    </w:p>
+    <w:p>
+      <w:pPr>
+        <w:rPr>
+          <w:rFonts w:hint="eastAsia"/>
+        </w:rPr>
+      </w:pPr>
+      <w:r>
+        <w:t>いった通りプロのコードを読んで、一部不適切だと判断し修正を入れた。（コア）ゲーム性はおもろいけどイラストメインで入ってたこともあって自分の技術を押せない。（プランナーが評価される作品だな、僕じゃないけど）ただしsteam発売予定と多くの人から高評をいただいた。</w:t>
+      </w:r>
+      <w:r>
+        <w:rPr>
+          <w:rFonts w:hint="eastAsia"/>
+        </w:rPr>
+        <w:t>後半はサブPMみたいなのやってた。</w:t>
       </w:r>
     </w:p>
     <w:sectPr>

</xml_diff>